<commit_message>
feat(modelo): rediseñar DER y especificaciones
- DER: Reemplazar Equipo por Personas con FK desde Usuarios y Comandas
- DER: Agregar TiposMovimiento y TiposModificacion como tablas auxiliares
- DER: Utilizar FK en lugar de texto libre en MovimientosStock y Modificaciones
- Especificaciones.docx: Modificar referencias
</commit_message>
<xml_diff>
--- a/Especificaciones.docx
+++ b/Especificaciones.docx
@@ -53,7 +53,7 @@
           <w:b w:val="0"/>
           <w:sz w:val="22"/>
         </w:rPr>
-        <w:t>La base de datos almacenará información sobre recetas, ingredientes, proveedores, usuarios, unidades de medida, costos, movimientos de stock y modificaciones realizadas durante la ejecución de una receta. El sistema diferenciará la información disponible según el perfil del usuario, garantizando que el personal operativo acceda únicamente a los datos necesarios para la producción, mientras que el personal administrativo pueda gestionar costos, precios e inventario.</w:t>
+        <w:t>La base de datos almacenará información sobre recetas, ingredientes, proveedores, personas, usuarios, unidades de medida, costos, movimientos de stock y modificaciones realizadas durante la ejecución de una receta. El sistema diferenciará la información disponible según el perfil del usuario, garantizando que el personal operativo acceda únicamente a los datos necesarios para la producción, mientras que el personal administrativo pueda gestionar costos, precios e inventario.</w:t>
       </w:r>
     </w:p>
     <w:p>
@@ -195,7 +195,7 @@
           <w:b w:val="0"/>
           <w:sz w:val="22"/>
         </w:rPr>
-        <w:t xml:space="preserve"> automáticamente cada comanda al integrante del equipo correspondiente según su sector (entradas, platos principales, postres, etc.).</w:t>
+        <w:t xml:space="preserve"> automáticamente cada comanda a la persona del equipo correspondiente según su sector (entradas, platos principales, postres, etc.).</w:t>
       </w:r>
     </w:p>
     <w:p>
@@ -294,17 +294,7 @@
           <w:b w:val="0"/>
           <w:sz w:val="22"/>
         </w:rPr>
-        <w:t>Registrar movimientos de stock (entradas, salidas y ajustes) para mantene</w:t>
-      </w:r>
-      <w:bookmarkStart w:id="0" w:name="_GoBack"/>
-      <w:bookmarkEnd w:id="0"/>
-      <w:r>
-        <w:rPr>
-          <w:rFonts w:ascii="Calibri" w:hAnsi="Calibri"/>
-          <w:b w:val="0"/>
-          <w:sz w:val="22"/>
-        </w:rPr>
-        <w:t>r un control actualizado de las cantidades disponibles.</w:t>
+        <w:t>Registrar movimientos de stock (entradas, salidas y ajustes) para mantener un control actualizado de las cantidades disponibles.</w:t>
       </w:r>
     </w:p>
     <w:p>
@@ -318,7 +308,7 @@
           <w:b w:val="0"/>
           <w:sz w:val="22"/>
         </w:rPr>
-        <w:t>Gestionar los integrantes del equipo de cocina y sus sectores.</w:t>
+        <w:t>Gestionar las personas del equipo de cocina y sus sectores.</w:t>
       </w:r>
     </w:p>
     <w:p>
@@ -350,19 +340,21 @@
         </w:pBdr>
         <w:spacing w:before="400" w:after="400"/>
         <w:jc w:val="center"/>
+        <w:rPr>
+          <w:rFonts w:hint="default"/>
+          <w:lang w:val="es-AR"/>
+        </w:rPr>
       </w:pPr>
       <w:r>
         <w:rPr>
-          <w:rFonts w:ascii="Calibri" w:hAnsi="Calibri"/>
-          <w:b w:val="0"/>
-          <w:color w:val="969696"/>
-          <w:sz w:val="24"/>
+          <w:rFonts w:hint="default"/>
+          <w:lang w:val="es-AR"/>
         </w:rPr>
         <w:drawing>
           <wp:inline distT="0" distB="0" distL="114300" distR="114300">
-            <wp:extent cx="5783580" cy="4026535"/>
-            <wp:effectExtent l="0" t="0" r="7620" b="12065"/>
-            <wp:docPr id="1" name="Imagen 1" descr="Recetario - BD2 TPI_2026-05-20T00_20_04.866Z"/>
+            <wp:extent cx="5764530" cy="4411345"/>
+            <wp:effectExtent l="0" t="0" r="7620" b="8255"/>
+            <wp:docPr id="1" name="Imagen 1" descr="Recetario - BD2 TPI_2026-06-02T01_07_57.781Z"/>
             <wp:cNvGraphicFramePr>
               <a:graphicFrameLocks xmlns:a="http://schemas.openxmlformats.org/drawingml/2006/main" noChangeAspect="1"/>
             </wp:cNvGraphicFramePr>
@@ -370,7 +362,7 @@
               <a:graphicData uri="http://schemas.openxmlformats.org/drawingml/2006/picture">
                 <pic:pic xmlns:pic="http://schemas.openxmlformats.org/drawingml/2006/picture">
                   <pic:nvPicPr>
-                    <pic:cNvPr id="1" name="Imagen 1" descr="Recetario - BD2 TPI_2026-05-20T00_20_04.866Z"/>
+                    <pic:cNvPr id="1" name="Imagen 1" descr="Recetario - BD2 TPI_2026-06-02T01_07_57.781Z"/>
                     <pic:cNvPicPr>
                       <a:picLocks noChangeAspect="1"/>
                     </pic:cNvPicPr>
@@ -384,7 +376,7 @@
                   <pic:spPr>
                     <a:xfrm>
                       <a:off x="0" y="0"/>
-                      <a:ext cx="5783580" cy="4026535"/>
+                      <a:ext cx="5764530" cy="4411345"/>
                     </a:xfrm>
                     <a:prstGeom prst="rect">
                       <a:avLst/>
@@ -396,6 +388,8 @@
           </wp:inline>
         </w:drawing>
       </w:r>
+      <w:bookmarkStart w:id="0" w:name="_GoBack"/>
+      <w:bookmarkEnd w:id="0"/>
     </w:p>
     <w:p/>
     <w:p/>
@@ -791,7 +785,7 @@
     <w:lsdException w:unhideWhenUsed="0" w:uiPriority="69" w:semiHidden="0" w:name="Medium Grid 3"/>
     <w:lsdException w:unhideWhenUsed="0" w:uiPriority="70" w:semiHidden="0" w:name="Dark List"/>
     <w:lsdException w:unhideWhenUsed="0" w:uiPriority="71" w:semiHidden="0" w:name="Colorful Shading"/>
-    <w:lsdException w:unhideWhenUsed="0" w:uiPriority="72" w:semiHidden="0" w:name="Colorful List"/>
+    <w:lsdException w:qFormat="1" w:unhideWhenUsed="0" w:uiPriority="72" w:semiHidden="0" w:name="Colorful List"/>
     <w:lsdException w:unhideWhenUsed="0" w:uiPriority="73" w:semiHidden="0" w:name="Colorful Grid"/>
     <w:lsdException w:unhideWhenUsed="0" w:uiPriority="60" w:semiHidden="0" w:name="Light Shading Accent 1"/>
     <w:lsdException w:unhideWhenUsed="0" w:uiPriority="61" w:semiHidden="0" w:name="Light List Accent 1"/>
@@ -863,7 +857,7 @@
     <w:lsdException w:unhideWhenUsed="0" w:uiPriority="68" w:semiHidden="0" w:name="Medium Grid 2 Accent 5"/>
     <w:lsdException w:unhideWhenUsed="0" w:uiPriority="69" w:semiHidden="0" w:name="Medium Grid 3 Accent 5"/>
     <w:lsdException w:unhideWhenUsed="0" w:uiPriority="70" w:semiHidden="0" w:name="Dark List Accent 5"/>
-    <w:lsdException w:unhideWhenUsed="0" w:uiPriority="71" w:semiHidden="0" w:name="Colorful Shading Accent 5"/>
+    <w:lsdException w:qFormat="1" w:unhideWhenUsed="0" w:uiPriority="71" w:semiHidden="0" w:name="Colorful Shading Accent 5"/>
     <w:lsdException w:unhideWhenUsed="0" w:uiPriority="72" w:semiHidden="0" w:name="Colorful List Accent 5"/>
     <w:lsdException w:unhideWhenUsed="0" w:uiPriority="73" w:semiHidden="0" w:name="Colorful Grid Accent 5"/>
     <w:lsdException w:unhideWhenUsed="0" w:uiPriority="60" w:semiHidden="0" w:name="Light Shading Accent 6"/>
@@ -877,7 +871,7 @@
     <w:lsdException w:unhideWhenUsed="0" w:uiPriority="68" w:semiHidden="0" w:name="Medium Grid 2 Accent 6"/>
     <w:lsdException w:unhideWhenUsed="0" w:uiPriority="69" w:semiHidden="0" w:name="Medium Grid 3 Accent 6"/>
     <w:lsdException w:unhideWhenUsed="0" w:uiPriority="70" w:semiHidden="0" w:name="Dark List Accent 6"/>
-    <w:lsdException w:unhideWhenUsed="0" w:uiPriority="71" w:semiHidden="0" w:name="Colorful Shading Accent 6"/>
+    <w:lsdException w:qFormat="1" w:unhideWhenUsed="0" w:uiPriority="71" w:semiHidden="0" w:name="Colorful Shading Accent 6"/>
     <w:lsdException w:unhideWhenUsed="0" w:uiPriority="72" w:semiHidden="0" w:name="Colorful List Accent 6"/>
     <w:lsdException w:unhideWhenUsed="0" w:uiPriority="73" w:semiHidden="0" w:name="Colorful Grid Accent 6"/>
   </w:latentStyles>
@@ -11257,6 +11251,7 @@
   <w:style w:type="table" w:styleId="148">
     <w:name w:val="Colorful Shading Accent 5"/>
     <w:basedOn w:val="12"/>
+    <w:qFormat/>
     <w:uiPriority w:val="71"/>
     <w:pPr>
       <w:spacing w:after="0" w:line="240" w:lineRule="auto"/>
@@ -11399,6 +11394,7 @@
   <w:style w:type="table" w:styleId="149">
     <w:name w:val="Colorful Shading Accent 6"/>
     <w:basedOn w:val="12"/>
+    <w:qFormat/>
     <w:uiPriority w:val="71"/>
     <w:pPr>
       <w:spacing w:after="0" w:line="240" w:lineRule="auto"/>
@@ -11541,6 +11537,7 @@
   <w:style w:type="table" w:styleId="150">
     <w:name w:val="Colorful List"/>
     <w:basedOn w:val="12"/>
+    <w:qFormat/>
     <w:uiPriority w:val="72"/>
     <w:pPr>
       <w:spacing w:after="0" w:line="240" w:lineRule="auto"/>

</xml_diff>